<commit_message>
actualizacion: se agrego evidencias de configuración de Git
</commit_message>
<xml_diff>
--- a/MAURO_POMAGUALLI_ACTIVIDAD1.docx
+++ b/MAURO_POMAGUALLI_ACTIVIDAD1.docx
@@ -276,13 +276,7 @@
         <w:rPr>
           <w:rFonts w:ascii="Arial" w:hAnsi="Arial" w:cs="Arial"/>
         </w:rPr>
-        <w:t xml:space="preserve"> </w:t>
-      </w:r>
-      <w:r>
-        <w:rPr>
-          <w:rFonts w:ascii="Arial" w:hAnsi="Arial" w:cs="Arial"/>
-        </w:rPr>
-        <w:t>Jorge Arun Zambrano Cedeño, Mg.</w:t>
+        <w:t xml:space="preserve"> Jorge Arun Zambrano Cedeño, Mg.</w:t>
       </w:r>
     </w:p>
     <w:tbl>
@@ -604,15 +598,7 @@
           <w:b/>
           <w:bCs/>
         </w:rPr>
-        <w:t xml:space="preserve"> </w:t>
-      </w:r>
-      <w:r>
-        <w:rPr>
-          <w:rFonts w:ascii="Arial" w:hAnsi="Arial" w:cs="Arial"/>
-          <w:b/>
-          <w:bCs/>
-        </w:rPr>
-        <w:t>Sistema de Gestión de Incidentes (</w:t>
+        <w:t xml:space="preserve"> Sistema de Gestión de Incidentes (</w:t>
       </w:r>
       <w:proofErr w:type="spellStart"/>
       <w:r>
@@ -1050,16 +1036,7 @@
           <w:bCs/>
           <w:lang w:eastAsia="es-EC"/>
         </w:rPr>
-        <w:t>1</w:t>
-      </w:r>
-      <w:r>
-        <w:rPr>
-          <w:rFonts w:ascii="Arial" w:hAnsi="Arial" w:cs="Arial"/>
-          <w:b/>
-          <w:bCs/>
-          <w:lang w:eastAsia="es-EC"/>
-        </w:rPr>
-        <w:t>: Estudio de Caso - Sistema de Gestión de Incidentes (</w:t>
+        <w:t>1: Estudio de Caso - Sistema de Gestión de Incidentes (</w:t>
       </w:r>
       <w:proofErr w:type="spellStart"/>
       <w:r>
@@ -1191,16 +1168,7 @@
           <w:bCs/>
           <w:lang w:eastAsia="es-EC"/>
         </w:rPr>
-        <w:t>Identificación de Actores Principales</w:t>
-      </w:r>
-      <w:r>
-        <w:rPr>
-          <w:rFonts w:ascii="Arial" w:hAnsi="Arial" w:cs="Arial"/>
-          <w:b/>
-          <w:bCs/>
-          <w:lang w:eastAsia="es-EC"/>
-        </w:rPr>
-        <w:t>.</w:t>
+        <w:t>Identificación de Actores Principales.</w:t>
       </w:r>
     </w:p>
     <w:p>
@@ -1525,16 +1493,7 @@
           <w:bCs/>
           <w:lang w:eastAsia="es-EC"/>
         </w:rPr>
-        <w:t>(RF)</w:t>
-      </w:r>
-      <w:r>
-        <w:rPr>
-          <w:rFonts w:ascii="Arial" w:hAnsi="Arial" w:cs="Arial"/>
-          <w:b/>
-          <w:bCs/>
-          <w:lang w:eastAsia="es-EC"/>
-        </w:rPr>
-        <w:t>.</w:t>
+        <w:t>(RF).</w:t>
       </w:r>
     </w:p>
     <w:p>
@@ -2019,6 +1978,7 @@
           <w:rFonts w:ascii="Arial" w:hAnsi="Arial" w:cs="Arial"/>
           <w:b/>
           <w:bCs/>
+          <w:noProof/>
           <w:lang w:eastAsia="es-EC"/>
         </w:rPr>
         <w:lastRenderedPageBreak/>
@@ -2159,28 +2119,7 @@
           <w:rFonts w:ascii="Arial" w:hAnsi="Arial" w:cs="Arial"/>
           <w:lang w:eastAsia="es-EC"/>
         </w:rPr>
-        <w:t>Para modelar específicamente cómo el personal técnico</w:t>
-      </w:r>
-      <w:r>
-        <w:rPr>
-          <w:rFonts w:ascii="Arial" w:hAnsi="Arial" w:cs="Arial"/>
-          <w:lang w:eastAsia="es-EC"/>
-        </w:rPr>
-        <w:t xml:space="preserve"> </w:t>
-      </w:r>
-      <w:r>
-        <w:rPr>
-          <w:rFonts w:ascii="Arial" w:hAnsi="Arial" w:cs="Arial"/>
-          <w:lang w:eastAsia="es-EC"/>
-        </w:rPr>
-        <w:t>interactúa de manera directa con los componentes físicos y lógicos de la infraestructura del Data Center, necesitamos un diagrama enfocado en la administración operativa y no en el usuario común</w:t>
-      </w:r>
-      <w:r>
-        <w:rPr>
-          <w:rFonts w:ascii="Arial" w:hAnsi="Arial" w:cs="Arial"/>
-          <w:lang w:eastAsia="es-EC"/>
-        </w:rPr>
-        <w:t>.</w:t>
+        <w:t>Para modelar específicamente cómo el personal técnico interactúa de manera directa con los componentes físicos y lógicos de la infraestructura del Data Center, necesitamos un diagrama enfocado en la administración operativa y no en el usuario común.</w:t>
       </w:r>
     </w:p>
     <w:p>
@@ -2297,6 +2236,7 @@
       <w:r>
         <w:rPr>
           <w:rFonts w:ascii="Arial" w:hAnsi="Arial" w:cs="Arial"/>
+          <w:noProof/>
           <w:lang w:eastAsia="es-EC"/>
         </w:rPr>
         <w:lastRenderedPageBreak/>
@@ -3997,6 +3937,84 @@
           <w:lang w:eastAsia="es-EC"/>
         </w:rPr>
       </w:pPr>
+    </w:p>
+    <w:p>
+      <w:pPr>
+        <w:pStyle w:val="Sinespaciado"/>
+        <w:numPr>
+          <w:ilvl w:val="0"/>
+          <w:numId w:val="22"/>
+        </w:numPr>
+        <w:spacing w:line="360" w:lineRule="auto"/>
+        <w:jc w:val="both"/>
+        <w:rPr>
+          <w:rFonts w:ascii="Arial" w:hAnsi="Arial" w:cs="Arial"/>
+          <w:b/>
+          <w:bCs/>
+          <w:lang w:eastAsia="es-EC"/>
+        </w:rPr>
+      </w:pPr>
+      <w:r>
+        <w:drawing>
+          <wp:anchor distT="0" distB="0" distL="114300" distR="114300" simplePos="0" relativeHeight="251670528" behindDoc="0" locked="0" layoutInCell="1" allowOverlap="1" wp14:anchorId="554096E7" wp14:editId="55E8C330">
+            <wp:simplePos x="0" y="0"/>
+            <wp:positionH relativeFrom="column">
+              <wp:posOffset>-635</wp:posOffset>
+            </wp:positionH>
+            <wp:positionV relativeFrom="paragraph">
+              <wp:posOffset>398780</wp:posOffset>
+            </wp:positionV>
+            <wp:extent cx="5398770" cy="1466850"/>
+            <wp:effectExtent l="0" t="0" r="0" b="0"/>
+            <wp:wrapSquare wrapText="bothSides"/>
+            <wp:docPr id="4" name="Imagen 4"/>
+            <wp:cNvGraphicFramePr>
+              <a:graphicFrameLocks xmlns:a="http://schemas.openxmlformats.org/drawingml/2006/main" noChangeAspect="1"/>
+            </wp:cNvGraphicFramePr>
+            <a:graphic xmlns:a="http://schemas.openxmlformats.org/drawingml/2006/main">
+              <a:graphicData uri="http://schemas.openxmlformats.org/drawingml/2006/picture">
+                <pic:pic xmlns:pic="http://schemas.openxmlformats.org/drawingml/2006/picture">
+                  <pic:nvPicPr>
+                    <pic:cNvPr id="1" name=""/>
+                    <pic:cNvPicPr/>
+                  </pic:nvPicPr>
+                  <pic:blipFill rotWithShape="1">
+                    <a:blip r:embed="rId17">
+                      <a:extLst>
+                        <a:ext uri="{28A0092B-C50C-407E-A947-70E740481C1C}">
+                          <a14:useLocalDpi xmlns:a14="http://schemas.microsoft.com/office/drawing/2010/main" val="0"/>
+                        </a:ext>
+                      </a:extLst>
+                    </a:blip>
+                    <a:srcRect b="53230"/>
+                    <a:stretch/>
+                  </pic:blipFill>
+                  <pic:spPr bwMode="auto">
+                    <a:xfrm>
+                      <a:off x="0" y="0"/>
+                      <a:ext cx="5398770" cy="1466850"/>
+                    </a:xfrm>
+                    <a:prstGeom prst="rect">
+                      <a:avLst/>
+                    </a:prstGeom>
+                    <a:ln>
+                      <a:noFill/>
+                    </a:ln>
+                    <a:extLst>
+                      <a:ext uri="{53640926-AAD7-44D8-BBD7-CCE9431645EC}">
+                        <a14:shadowObscured xmlns:a14="http://schemas.microsoft.com/office/drawing/2010/main"/>
+                      </a:ext>
+                    </a:extLst>
+                  </pic:spPr>
+                </pic:pic>
+              </a:graphicData>
+            </a:graphic>
+            <wp14:sizeRelV relativeFrom="margin">
+              <wp14:pctHeight>0</wp14:pctHeight>
+            </wp14:sizeRelV>
+          </wp:anchor>
+        </w:drawing>
+      </w:r>
       <w:r>
         <w:rPr>
           <w:rFonts w:ascii="Arial" w:hAnsi="Arial" w:cs="Arial"/>
@@ -4005,6 +4023,199 @@
           <w:lang w:eastAsia="es-EC"/>
         </w:rPr>
         <w:t>EVIDENCIAS</w:t>
+      </w:r>
+    </w:p>
+    <w:p/>
+    <w:p>
+      <w:r>
+        <w:drawing>
+          <wp:anchor distT="0" distB="0" distL="114300" distR="114300" simplePos="0" relativeHeight="251672576" behindDoc="0" locked="0" layoutInCell="1" allowOverlap="1" wp14:anchorId="3B27FD22" wp14:editId="532A4C38">
+            <wp:simplePos x="0" y="0"/>
+            <wp:positionH relativeFrom="margin">
+              <wp:align>left</wp:align>
+            </wp:positionH>
+            <wp:positionV relativeFrom="paragraph">
+              <wp:posOffset>297815</wp:posOffset>
+            </wp:positionV>
+            <wp:extent cx="5400040" cy="2413000"/>
+            <wp:effectExtent l="0" t="0" r="0" b="6350"/>
+            <wp:wrapSquare wrapText="bothSides"/>
+            <wp:docPr id="7" name="Imagen 7"/>
+            <wp:cNvGraphicFramePr>
+              <a:graphicFrameLocks xmlns:a="http://schemas.openxmlformats.org/drawingml/2006/main" noChangeAspect="1"/>
+            </wp:cNvGraphicFramePr>
+            <a:graphic xmlns:a="http://schemas.openxmlformats.org/drawingml/2006/main">
+              <a:graphicData uri="http://schemas.openxmlformats.org/drawingml/2006/picture">
+                <pic:pic xmlns:pic="http://schemas.openxmlformats.org/drawingml/2006/picture">
+                  <pic:nvPicPr>
+                    <pic:cNvPr id="1" name=""/>
+                    <pic:cNvPicPr/>
+                  </pic:nvPicPr>
+                  <pic:blipFill rotWithShape="1">
+                    <a:blip r:embed="rId18">
+                      <a:extLst>
+                        <a:ext uri="{28A0092B-C50C-407E-A947-70E740481C1C}">
+                          <a14:useLocalDpi xmlns:a14="http://schemas.microsoft.com/office/drawing/2010/main" val="0"/>
+                        </a:ext>
+                      </a:extLst>
+                    </a:blip>
+                    <a:srcRect b="22099"/>
+                    <a:stretch/>
+                  </pic:blipFill>
+                  <pic:spPr bwMode="auto">
+                    <a:xfrm>
+                      <a:off x="0" y="0"/>
+                      <a:ext cx="5400040" cy="2413000"/>
+                    </a:xfrm>
+                    <a:prstGeom prst="rect">
+                      <a:avLst/>
+                    </a:prstGeom>
+                    <a:ln>
+                      <a:noFill/>
+                    </a:ln>
+                    <a:extLst>
+                      <a:ext uri="{53640926-AAD7-44D8-BBD7-CCE9431645EC}">
+                        <a14:shadowObscured xmlns:a14="http://schemas.microsoft.com/office/drawing/2010/main"/>
+                      </a:ext>
+                    </a:extLst>
+                  </pic:spPr>
+                </pic:pic>
+              </a:graphicData>
+            </a:graphic>
+            <wp14:sizeRelV relativeFrom="margin">
+              <wp14:pctHeight>0</wp14:pctHeight>
+            </wp14:sizeRelV>
+          </wp:anchor>
+        </w:drawing>
+      </w:r>
+      <w:r>
+        <w:t>REALIZAMOS EL PRIMER COMMIT</w:t>
+      </w:r>
+    </w:p>
+    <w:p>
+      <w:pPr>
+        <w:rPr>
+          <w:b/>
+          <w:bCs/>
+        </w:rPr>
+      </w:pPr>
+      <w:r>
+        <w:rPr>
+          <w:rFonts w:ascii="Arial" w:hAnsi="Arial" w:cs="Arial"/>
+          <w:b/>
+          <w:bCs/>
+          <w:lang w:eastAsia="es-EC"/>
+        </w:rPr>
+        <w:br w:type="page"/>
+      </w:r>
+      <w:r>
+        <w:rPr>
+          <w:b/>
+          <w:bCs/>
+        </w:rPr>
+        <w:lastRenderedPageBreak/>
+        <w:t>CREAMOS EL REPOSITORIO EN GITHUB</w:t>
+      </w:r>
+    </w:p>
+    <w:p>
+      <w:pPr>
+        <w:rPr>
+          <w:b/>
+          <w:bCs/>
+        </w:rPr>
+      </w:pPr>
+      <w:r>
+        <w:drawing>
+          <wp:inline distT="0" distB="0" distL="0" distR="0" wp14:anchorId="4EC58D9B" wp14:editId="41C0D0F9">
+            <wp:extent cx="5400040" cy="2310097"/>
+            <wp:effectExtent l="0" t="0" r="0" b="0"/>
+            <wp:docPr id="8" name="Imagen 8"/>
+            <wp:cNvGraphicFramePr>
+              <a:graphicFrameLocks xmlns:a="http://schemas.openxmlformats.org/drawingml/2006/main" noChangeAspect="1"/>
+            </wp:cNvGraphicFramePr>
+            <a:graphic xmlns:a="http://schemas.openxmlformats.org/drawingml/2006/main">
+              <a:graphicData uri="http://schemas.openxmlformats.org/drawingml/2006/picture">
+                <pic:pic xmlns:pic="http://schemas.openxmlformats.org/drawingml/2006/picture">
+                  <pic:nvPicPr>
+                    <pic:cNvPr id="1" name=""/>
+                    <pic:cNvPicPr/>
+                  </pic:nvPicPr>
+                  <pic:blipFill>
+                    <a:blip r:embed="rId19"/>
+                    <a:stretch>
+                      <a:fillRect/>
+                    </a:stretch>
+                  </pic:blipFill>
+                  <pic:spPr>
+                    <a:xfrm>
+                      <a:off x="0" y="0"/>
+                      <a:ext cx="5400040" cy="2310097"/>
+                    </a:xfrm>
+                    <a:prstGeom prst="rect">
+                      <a:avLst/>
+                    </a:prstGeom>
+                  </pic:spPr>
+                </pic:pic>
+              </a:graphicData>
+            </a:graphic>
+          </wp:inline>
+        </w:drawing>
+      </w:r>
+    </w:p>
+    <w:p>
+      <w:r>
+        <w:t>SE AÑADE UN DISPOSITIVO REMOTO, CRACI</w:t>
+      </w:r>
+      <w:r>
+        <w:t>Ó</w:t>
+      </w:r>
+      <w:r>
+        <w:t>N DE UNA RAMA MAIN, Y REALIZAMOS EL PRIMER PUSH.</w:t>
+      </w:r>
+    </w:p>
+    <w:p>
+      <w:pPr>
+        <w:rPr>
+          <w:b/>
+          <w:bCs/>
+        </w:rPr>
+      </w:pPr>
+      <w:r>
+        <w:drawing>
+          <wp:inline distT="0" distB="0" distL="0" distR="0" wp14:anchorId="037C272D" wp14:editId="7635AC12">
+            <wp:extent cx="5400040" cy="2397260"/>
+            <wp:effectExtent l="0" t="0" r="0" b="3175"/>
+            <wp:docPr id="9" name="Imagen 9"/>
+            <wp:cNvGraphicFramePr>
+              <a:graphicFrameLocks xmlns:a="http://schemas.openxmlformats.org/drawingml/2006/main" noChangeAspect="1"/>
+            </wp:cNvGraphicFramePr>
+            <a:graphic xmlns:a="http://schemas.openxmlformats.org/drawingml/2006/main">
+              <a:graphicData uri="http://schemas.openxmlformats.org/drawingml/2006/picture">
+                <pic:pic xmlns:pic="http://schemas.openxmlformats.org/drawingml/2006/picture">
+                  <pic:nvPicPr>
+                    <pic:cNvPr id="1" name=""/>
+                    <pic:cNvPicPr/>
+                  </pic:nvPicPr>
+                  <pic:blipFill>
+                    <a:blip r:embed="rId20"/>
+                    <a:stretch>
+                      <a:fillRect/>
+                    </a:stretch>
+                  </pic:blipFill>
+                  <pic:spPr>
+                    <a:xfrm>
+                      <a:off x="0" y="0"/>
+                      <a:ext cx="5400040" cy="2397260"/>
+                    </a:xfrm>
+                    <a:prstGeom prst="rect">
+                      <a:avLst/>
+                    </a:prstGeom>
+                  </pic:spPr>
+                </pic:pic>
+              </a:graphicData>
+            </a:graphic>
+          </wp:inline>
+        </w:drawing>
       </w:r>
     </w:p>
     <w:p>
@@ -4027,35 +4238,6 @@
           <w:lang w:eastAsia="es-EC"/>
         </w:rPr>
       </w:pPr>
-      <w:r>
-        <w:rPr>
-          <w:rFonts w:ascii="Arial" w:hAnsi="Arial" w:cs="Arial"/>
-          <w:b/>
-          <w:bCs/>
-          <w:i/>
-          <w:iCs/>
-          <w:lang w:eastAsia="es-EC"/>
-        </w:rPr>
-        <w:t>(</w:t>
-      </w:r>
-      <w:r>
-        <w:rPr>
-          <w:rFonts w:ascii="Arial" w:eastAsia="Arial" w:hAnsi="Arial" w:cs="Arial"/>
-          <w:i/>
-          <w:iCs/>
-          <w:color w:val="000000"/>
-        </w:rPr>
-        <w:t>Código de la ejecución de los ejercicios, enlace drive donde se encuentren los mismos y Capturas de pantalla claras y relevantes, donde evidencie el proceso realizado).</w:t>
-      </w:r>
-      <w:r>
-        <w:rPr>
-          <w:rFonts w:ascii="Arial" w:hAnsi="Arial" w:cs="Arial"/>
-          <w:b/>
-          <w:bCs/>
-          <w:lang w:eastAsia="es-EC"/>
-        </w:rPr>
-        <w:br w:type="page"/>
-      </w:r>
     </w:p>
     <w:p>
       <w:pPr>
@@ -4076,7 +4258,6 @@
           <w:bCs/>
           <w:lang w:eastAsia="es-EC"/>
         </w:rPr>
-        <w:lastRenderedPageBreak/>
         <w:t>Bibliografía</w:t>
       </w:r>
     </w:p>
@@ -4110,7 +4291,7 @@
       </w:r>
     </w:p>
     <w:sectPr>
-      <w:headerReference w:type="first" r:id="rId17"/>
+      <w:headerReference w:type="first" r:id="rId21"/>
       <w:pgSz w:w="11906" w:h="16838"/>
       <w:pgMar w:top="1417" w:right="1701" w:bottom="1417" w:left="1701" w:header="708" w:footer="708" w:gutter="0"/>
       <w:pgNumType w:start="1"/>
@@ -4986,7 +5167,7 @@
         <v:path o:extrusionok="f" gradientshapeok="t" o:connecttype="rect"/>
         <o:lock v:ext="edit" aspectratio="t"/>
       </v:shapetype>
-      <v:shape id="_x0000_i1619" type="#_x0000_t75" style="width:11.5pt;height:11.5pt" o:bullet="t">
+      <v:shape id="_x0000_i1045" type="#_x0000_t75" style="width:11.5pt;height:11.5pt" o:bullet="t">
         <v:imagedata r:id="rId1" o:title="mso3E28"/>
       </v:shape>
     </w:pict>
@@ -9184,6 +9365,7 @@
     <w:lsdException w:name="HTML Sample" w:semiHidden="1" w:unhideWhenUsed="1"/>
     <w:lsdException w:name="HTML Typewriter" w:semiHidden="1" w:unhideWhenUsed="1"/>
     <w:lsdException w:name="HTML Variable" w:semiHidden="1" w:unhideWhenUsed="1"/>
+    <w:lsdException w:name="Normal Table" w:semiHidden="1" w:unhideWhenUsed="1"/>
     <w:lsdException w:name="annotation subject" w:semiHidden="1" w:unhideWhenUsed="1"/>
     <w:lsdException w:name="No List" w:semiHidden="1" w:unhideWhenUsed="1"/>
     <w:lsdException w:name="Outline List 1" w:semiHidden="1" w:unhideWhenUsed="1"/>
@@ -9230,8 +9412,10 @@
     <w:lsdException w:name="Table Subtle 2" w:semiHidden="1" w:unhideWhenUsed="1"/>
     <w:lsdException w:name="Table Web 1" w:semiHidden="1" w:unhideWhenUsed="1"/>
     <w:lsdException w:name="Table Web 2" w:semiHidden="1" w:unhideWhenUsed="1"/>
+    <w:lsdException w:name="Table Web 3" w:semiHidden="1" w:unhideWhenUsed="1"/>
     <w:lsdException w:name="Balloon Text" w:semiHidden="1" w:unhideWhenUsed="1"/>
     <w:lsdException w:name="Table Grid" w:uiPriority="39"/>
+    <w:lsdException w:name="Table Theme" w:semiHidden="1" w:unhideWhenUsed="1"/>
     <w:lsdException w:name="Placeholder Text" w:semiHidden="1"/>
     <w:lsdException w:name="No Spacing" w:uiPriority="1" w:qFormat="1"/>
     <w:lsdException w:name="Light Shading" w:uiPriority="60"/>

</xml_diff>

<commit_message>
commit update: ENTREGA DE TAREA 1 EN PDF
</commit_message>
<xml_diff>
--- a/MAURO_POMAGUALLI_ACTIVIDAD1.docx
+++ b/MAURO_POMAGUALLI_ACTIVIDAD1.docx
@@ -3731,14 +3731,7 @@
           <w:rFonts w:ascii="Arial" w:hAnsi="Arial" w:cs="Arial"/>
           <w:lang w:eastAsia="es-EC"/>
         </w:rPr>
-        <w:t xml:space="preserve">Definir </w:t>
-      </w:r>
-      <w:r>
-        <w:rPr>
-          <w:rFonts w:ascii="Arial" w:hAnsi="Arial" w:cs="Arial"/>
-          <w:lang w:eastAsia="es-EC"/>
-        </w:rPr>
-        <w:t xml:space="preserve">una dependencia de uno a muchos entre objetos, de modo que cuando un objeto principal cambie su estado, todos sus dependientes sean notificados y actualizados de manera automática. En el sistema de </w:t>
+        <w:t xml:space="preserve">Definir una dependencia de uno a muchos entre objetos, de modo que cuando un objeto principal cambie su estado, todos sus dependientes sean notificados y actualizados de manera automática. En el sistema de </w:t>
       </w:r>
       <w:proofErr w:type="spellStart"/>
       <w:r>
@@ -4735,6 +4728,7 @@
           <w:rFonts w:ascii="Arial" w:eastAsiaTheme="majorEastAsia" w:hAnsi="Arial" w:cs="Arial"/>
           <w:b/>
           <w:bCs/>
+          <w:noProof/>
           <w:color w:val="2F5496" w:themeColor="accent1" w:themeShade="BF"/>
           <w:lang w:eastAsia="es-EC"/>
         </w:rPr>
@@ -5101,14 +5095,18 @@
           <w:rFonts w:ascii="Arial" w:hAnsi="Arial" w:cs="Arial"/>
           <w:b/>
           <w:bCs/>
-          <w:lang w:eastAsia="es-EC"/>
-        </w:rPr>
-      </w:pPr>
-      <w:r>
-        <w:rPr>
-          <w:rFonts w:ascii="Arial" w:hAnsi="Arial" w:cs="Arial"/>
-          <w:b/>
-          <w:bCs/>
+          <w:sz w:val="24"/>
+          <w:szCs w:val="24"/>
+          <w:lang w:eastAsia="es-EC"/>
+        </w:rPr>
+      </w:pPr>
+      <w:r>
+        <w:rPr>
+          <w:rFonts w:ascii="Arial" w:hAnsi="Arial" w:cs="Arial"/>
+          <w:b/>
+          <w:bCs/>
+          <w:sz w:val="24"/>
+          <w:szCs w:val="24"/>
           <w:lang w:eastAsia="es-EC"/>
         </w:rPr>
         <w:lastRenderedPageBreak/>
@@ -6390,7 +6388,7 @@
         <v:path o:extrusionok="f" gradientshapeok="t" o:connecttype="rect"/>
         <o:lock v:ext="edit" aspectratio="t"/>
       </v:shapetype>
-      <v:shape id="_x0000_i1117" type="#_x0000_t75" style="width:11.5pt;height:11.5pt" o:bullet="t">
+      <v:shape id="_x0000_i1131" type="#_x0000_t75" style="width:11.5pt;height:11.5pt" o:bullet="t">
         <v:imagedata r:id="rId1" o:title="mso3E28"/>
       </v:shape>
     </w:pict>

</xml_diff>